<commit_message>
Reemplazar Random Forest por SVM polinómico y SVM gaussiano (modelos del docente)
- Nuevos modelos de Alejandro: src/models/svm_polinomico.py (grado 3, coef0=1) y
  src/models/svm_gaussiano.py (RBF), ambos con C=1, class_weight="balanced" y probabilidades de Platt.
- Notebooks 03a_svm_polinomico y 03b_svm_gaussiano ejecutados con interpretaciones;
  el notebook 05 compara los 4 modelos (tabla, ROC, matrices y validación cruzada).
- Ganador: SVM gaussiano (F1 0,909, AUC 0,991) como modelo por defecto de la app.
- Se eliminan random_forest.py, 03_random_forest.ipynb y modelo_rf.pkl (respaldo local fuera del repo).
- App con 4 tarjetas de modelos, README, guía de Render, capturas e informe actualizados.

Co-Authored-By: Claude Opus 5.5 <noreply@anthropic.com>
Claude-Session: https://claude.ai/code/session_01DwkYtLVpaZFFCWi636dybn
</commit_message>
<xml_diff>
--- a/docs/Informe_PhishGuard.docx
+++ b/docs/Informe_PhishGuard.docx
@@ -34,7 +34,7 @@
     </w:p>
     <w:p>
       <w:pPr>
-        <w:spacing w:line="360"/>
+        <w:spacing w:after="0" w:before="0" w:line="360"/>
         <w:jc w:val="center"/>
       </w:pPr>
       <w:r>
@@ -43,17 +43,7 @@
           <w:sz w:val="24"/>
           <w:szCs w:val="24"/>
         </w:rPr>
-        <w:t xml:space="preserve">Inteligencia Artificial, </w:t>
-      </w:r>
-      <w:r>
-        <w:rPr>
-          <w:rFonts w:ascii="Times New Roman" w:cs="Times New Roman" w:eastAsia="Times New Roman" w:hAnsi="Times New Roman"/>
-          <w:sz w:val="24"/>
-          <w:szCs w:val="24"/>
-          <w:highlight w:val="yellow"/>
-          <w:highlightCs w:val="yellow"/>
-        </w:rPr>
-        <w:t xml:space="preserve">[Nombre del docente]</w:t>
+        <w:t xml:space="preserve">Inteligencia Artificial</w:t>
       </w:r>
     </w:p>
     <w:p>
@@ -173,7 +163,7 @@
           <w:sz w:val="24"/>
           <w:szCs w:val="24"/>
         </w:rPr>
-        <w:t xml:space="preserve"> a partir únicamente de sus características léxicas y estructurales, sin visitar la página. Se entrenaron y compararon tres modelos supervisados de scikit-learn (Regresión Logística, Random Forest y SVM lineal) y el ganador se desplegó en una aplicación web con Streamlit que entrega la probabilidad de phishing de 0 a 100 %.</w:t>
+        <w:t xml:space="preserve"> a partir únicamente de sus características léxicas y estructurales, sin visitar la página. Se entrenaron y compararon cuatro modelos supervisados de scikit-learn (Regresión Logística, SVM lineal, SVM con kernel polinómico y SVM con kernel gaussiano) y el ganador se desplegó en una aplicación web con Streamlit que entrega la probabilidad de phishing de 0 a 100 %.</w:t>
       </w:r>
     </w:p>
     <w:p>
@@ -556,7 +546,7 @@
       <w:r>
         <w:drawing>
           <wp:inline distT="0" distB="0" distL="0" distR="0">
-            <wp:extent cx="2162175" cy="1514475"/>
+            <wp:extent cx="1943100" cy="1352550"/>
             <wp:effectExtent t="0" r="0" b="0" l="0"/>
             <wp:docPr id="1" name="" descr="" title=""/>
             <wp:cNvGraphicFramePr>
@@ -581,7 +571,7 @@
                   <pic:spPr bwMode="auto">
                     <a:xfrm>
                       <a:off x="0" y="0"/>
-                      <a:ext cx="2162175" cy="1514475"/>
+                      <a:ext cx="1943100" cy="1352550"/>
                     </a:xfrm>
                     <a:prstGeom prst="rect">
                       <a:avLst/>
@@ -604,7 +594,7 @@
       <w:r>
         <w:drawing>
           <wp:inline distT="0" distB="0" distL="0" distR="0">
-            <wp:extent cx="2266950" cy="1352550"/>
+            <wp:extent cx="2047875" cy="1219200"/>
             <wp:effectExtent t="0" r="0" b="0" l="0"/>
             <wp:docPr id="1" name="" descr="" title=""/>
             <wp:cNvGraphicFramePr>
@@ -629,7 +619,7 @@
                   <pic:spPr bwMode="auto">
                     <a:xfrm>
                       <a:off x="0" y="0"/>
-                      <a:ext cx="2266950" cy="1352550"/>
+                      <a:ext cx="2047875" cy="1219200"/>
                     </a:xfrm>
                     <a:prstGeom prst="rect">
                       <a:avLst/>
@@ -687,7 +677,7 @@
           <w:sz w:val="24"/>
           <w:szCs w:val="24"/>
         </w:rPr>
-        <w:t xml:space="preserve">) que usan por igual los notebooks, los scripts y la aplicación, de modo que los tres modelos se entrenan con </w:t>
+        <w:t xml:space="preserve">) que usan por igual los notebooks, los scripts y la aplicación, de modo que los cuatro modelos se entrenan con </w:t>
       </w:r>
       <w:r>
         <w:rPr>
@@ -753,25 +743,7 @@
           <w:sz w:val="24"/>
           <w:szCs w:val="24"/>
         </w:rPr>
-        <w:t xml:space="preserve"> para los modelos lineales o </w:t>
-      </w:r>
-      <w:r>
-        <w:rPr>
-          <w:rFonts w:ascii="Times New Roman" w:cs="Times New Roman" w:eastAsia="Times New Roman" w:hAnsi="Times New Roman"/>
-          <w:i/>
-          <w:iCs/>
-          <w:sz w:val="24"/>
-          <w:szCs w:val="24"/>
-        </w:rPr>
-        <w:t xml:space="preserve">passthrough</w:t>
-      </w:r>
-      <w:r>
-        <w:rPr>
-          <w:rFonts w:ascii="Times New Roman" w:cs="Times New Roman" w:eastAsia="Times New Roman" w:hAnsi="Times New Roman"/>
-          <w:sz w:val="24"/>
-          <w:szCs w:val="24"/>
-        </w:rPr>
-        <w:t xml:space="preserve"> para Random Forest, seguido del clasificador), lo que evita fuga de información al escalar. El pipeline se exporta con </w:t>
+        <w:t xml:space="preserve">, necesario porque los cuatro modelos son sensibles a la escala, seguido del clasificador), lo que evita fuga de información al escalar. El pipeline se exporta con </w:t>
       </w:r>
       <w:r>
         <w:rPr>
@@ -912,7 +884,7 @@
       <w:r>
         <w:drawing>
           <wp:inline distT="0" distB="0" distL="0" distR="0">
-            <wp:extent cx="4857750" cy="1666875"/>
+            <wp:extent cx="4495800" cy="1543050"/>
             <wp:effectExtent t="0" r="0" b="0" l="0"/>
             <wp:docPr id="1" name="" descr="" title=""/>
             <wp:cNvGraphicFramePr>
@@ -937,7 +909,7 @@
                   <pic:spPr bwMode="auto">
                     <a:xfrm>
                       <a:off x="0" y="0"/>
-                      <a:ext cx="4857750" cy="1666875"/>
+                      <a:ext cx="4495800" cy="1543050"/>
                     </a:xfrm>
                     <a:prstGeom prst="rect">
                       <a:avLst/>
@@ -979,7 +951,7 @@
           <w:sz w:val="24"/>
           <w:szCs w:val="24"/>
         </w:rPr>
-        <w:t xml:space="preserve">Se entrenaron tres modelos con 92.184 URLs (80 %) y se evaluaron con 23.047 URLs de prueba (20 %, de las cuales 3.318 son phishing). La Tabla 1 resume sus configuraciones y la Tabla 2 sus resultados.</w:t>
+        <w:t xml:space="preserve">Se entrenaron cuatro modelos con 92.184 URLs (80 %) y se evaluaron con 23.047 URLs de prueba (20 %, de las cuales 3.318 son phishing). La Tabla 1 resume sus configuraciones y la Tabla 2 sus resultados.</w:t>
       </w:r>
     </w:p>
     <w:p>
@@ -1028,9 +1000,9 @@
         </w:tblBorders>
       </w:tblPr>
       <w:tblGrid>
-        <w:gridCol w:w="2600"/>
-        <w:gridCol w:w="4410"/>
-        <w:gridCol w:w="1500"/>
+        <w:gridCol w:w="2500"/>
+        <w:gridCol w:w="4610"/>
+        <w:gridCol w:w="1400"/>
       </w:tblGrid>
       <w:tr>
         <w:trPr>
@@ -1038,7 +1010,7 @@
         </w:trPr>
         <w:tc>
           <w:tcPr>
-            <w:tcW w:type="dxa" w:w="2600"/>
+            <w:tcW w:type="dxa" w:w="2500"/>
             <w:tcBorders>
               <w:top w:val="single" w:color="000000" w:sz="6"/>
               <w:left w:val="none" w:color="FFFFFF" w:sz="0"/>
@@ -1072,7 +1044,7 @@
         </w:tc>
         <w:tc>
           <w:tcPr>
-            <w:tcW w:type="dxa" w:w="4410"/>
+            <w:tcW w:type="dxa" w:w="4610"/>
             <w:tcBorders>
               <w:top w:val="single" w:color="000000" w:sz="6"/>
               <w:left w:val="none" w:color="FFFFFF" w:sz="0"/>
@@ -1106,7 +1078,7 @@
         </w:tc>
         <w:tc>
           <w:tcPr>
-            <w:tcW w:type="dxa" w:w="1500"/>
+            <w:tcW w:type="dxa" w:w="1400"/>
             <w:tcBorders>
               <w:top w:val="single" w:color="000000" w:sz="6"/>
               <w:left w:val="none" w:color="FFFFFF" w:sz="0"/>
@@ -1134,7 +1106,7 @@
                 <w:sz w:val="20"/>
                 <w:szCs w:val="20"/>
               </w:rPr>
-              <w:t xml:space="preserve">Escalado</w:t>
+              <w:t xml:space="preserve">Probabilidad</w:t>
             </w:r>
           </w:p>
         </w:tc>
@@ -1145,7 +1117,7 @@
         </w:trPr>
         <w:tc>
           <w:tcPr>
-            <w:tcW w:type="dxa" w:w="2600"/>
+            <w:tcW w:type="dxa" w:w="2500"/>
             <w:tcBorders>
               <w:top w:val="none" w:color="FFFFFF" w:sz="0"/>
               <w:left w:val="none" w:color="FFFFFF" w:sz="0"/>
@@ -1179,7 +1151,7 @@
         </w:tc>
         <w:tc>
           <w:tcPr>
-            <w:tcW w:type="dxa" w:w="4410"/>
+            <w:tcW w:type="dxa" w:w="4610"/>
             <w:tcBorders>
               <w:top w:val="none" w:color="FFFFFF" w:sz="0"/>
               <w:left w:val="none" w:color="FFFFFF" w:sz="0"/>
@@ -1247,7 +1219,7 @@
         </w:tc>
         <w:tc>
           <w:tcPr>
-            <w:tcW w:type="dxa" w:w="1500"/>
+            <w:tcW w:type="dxa" w:w="1400"/>
             <w:tcBorders>
               <w:top w:val="none" w:color="FFFFFF" w:sz="0"/>
               <w:left w:val="none" w:color="FFFFFF" w:sz="0"/>
@@ -1275,7 +1247,7 @@
                 <w:sz w:val="20"/>
                 <w:szCs w:val="20"/>
               </w:rPr>
-              <w:t xml:space="preserve">StandardScaler</w:t>
+              <w:t xml:space="preserve">Sigmoide</w:t>
             </w:r>
           </w:p>
         </w:tc>
@@ -1286,7 +1258,7 @@
         </w:trPr>
         <w:tc>
           <w:tcPr>
-            <w:tcW w:type="dxa" w:w="2600"/>
+            <w:tcW w:type="dxa" w:w="2500"/>
             <w:tcBorders>
               <w:top w:val="none" w:color="FFFFFF" w:sz="0"/>
               <w:left w:val="none" w:color="FFFFFF" w:sz="0"/>
@@ -1314,13 +1286,13 @@
                 <w:sz w:val="20"/>
                 <w:szCs w:val="20"/>
               </w:rPr>
-              <w:t xml:space="preserve">Random Forest (Alejandro Flores)</w:t>
-            </w:r>
-          </w:p>
-        </w:tc>
-        <w:tc>
-          <w:tcPr>
-            <w:tcW w:type="dxa" w:w="4410"/>
+              <w:t xml:space="preserve">SVM lineal (Gloria Chushig)</w:t>
+            </w:r>
+          </w:p>
+        </w:tc>
+        <w:tc>
+          <w:tcPr>
+            <w:tcW w:type="dxa" w:w="4610"/>
             <w:tcBorders>
               <w:top w:val="none" w:color="FFFFFF" w:sz="0"/>
               <w:left w:val="none" w:color="FFFFFF" w:sz="0"/>
@@ -1340,23 +1312,13 @@
               <w:spacing w:line="240"/>
               <w:jc w:val="center"/>
             </w:pPr>
-            <w:r>
-              <w:rPr>
-                <w:rFonts w:ascii="Times New Roman" w:cs="Times New Roman" w:eastAsia="Times New Roman" w:hAnsi="Times New Roman"/>
-                <w:b w:val="false"/>
-                <w:bCs w:val="false"/>
-                <w:sz w:val="20"/>
-                <w:szCs w:val="20"/>
-              </w:rPr>
-              <w:t xml:space="preserve">100 árboles, </w:t>
-            </w:r>
             <w:r>
               <w:rPr>
                 <w:rFonts w:ascii="Courier New" w:cs="Courier New" w:eastAsia="Courier New" w:hAnsi="Courier New"/>
                 <w:sz w:val="17"/>
                 <w:szCs w:val="17"/>
               </w:rPr>
-              <w:t xml:space="preserve">max_depth=20</w:t>
+              <w:t xml:space="preserve">LinearSVC(C=1.0, class_weight="balanced")</w:t>
             </w:r>
             <w:r>
               <w:rPr>
@@ -1366,16 +1328,32 @@
                 <w:sz w:val="20"/>
                 <w:szCs w:val="20"/>
               </w:rPr>
-              <w:t xml:space="preserve">, </w:t>
-            </w:r>
-            <w:r>
-              <w:rPr>
-                <w:rFonts w:ascii="Courier New" w:cs="Courier New" w:eastAsia="Courier New" w:hAnsi="Courier New"/>
-                <w:sz w:val="17"/>
-                <w:szCs w:val="17"/>
-              </w:rPr>
-              <w:t xml:space="preserve">min_samples_leaf=2</w:t>
-            </w:r>
+              <w:t xml:space="preserve"> calibrado (sigmoide, 5 particiones)</w:t>
+            </w:r>
+          </w:p>
+        </w:tc>
+        <w:tc>
+          <w:tcPr>
+            <w:tcW w:type="dxa" w:w="1400"/>
+            <w:tcBorders>
+              <w:top w:val="none" w:color="FFFFFF" w:sz="0"/>
+              <w:left w:val="none" w:color="FFFFFF" w:sz="0"/>
+              <w:bottom w:val="none" w:color="FFFFFF" w:sz="0"/>
+              <w:right w:val="none" w:color="FFFFFF" w:sz="0"/>
+            </w:tcBorders>
+            <w:tcMar>
+              <w:top w:type="dxa" w:w="40"/>
+              <w:left w:type="dxa" w:w="80"/>
+              <w:bottom w:type="dxa" w:w="40"/>
+              <w:right w:type="dxa" w:w="80"/>
+            </w:tcMar>
+            <w:vAlign w:val="center"/>
+          </w:tcPr>
+          <w:p>
+            <w:pPr>
+              <w:spacing w:line="240"/>
+              <w:jc w:val="center"/>
+            </w:pPr>
             <w:r>
               <w:rPr>
                 <w:rFonts w:ascii="Times New Roman" w:cs="Times New Roman" w:eastAsia="Times New Roman" w:hAnsi="Times New Roman"/>
@@ -1384,49 +1362,7 @@
                 <w:sz w:val="20"/>
                 <w:szCs w:val="20"/>
               </w:rPr>
-              <w:t xml:space="preserve">, </w:t>
-            </w:r>
-            <w:r>
-              <w:rPr>
-                <w:rFonts w:ascii="Courier New" w:cs="Courier New" w:eastAsia="Courier New" w:hAnsi="Courier New"/>
-                <w:sz w:val="17"/>
-                <w:szCs w:val="17"/>
-              </w:rPr>
-              <w:t xml:space="preserve">class_weight="balanced"</w:t>
-            </w:r>
-          </w:p>
-        </w:tc>
-        <w:tc>
-          <w:tcPr>
-            <w:tcW w:type="dxa" w:w="1500"/>
-            <w:tcBorders>
-              <w:top w:val="none" w:color="FFFFFF" w:sz="0"/>
-              <w:left w:val="none" w:color="FFFFFF" w:sz="0"/>
-              <w:bottom w:val="none" w:color="FFFFFF" w:sz="0"/>
-              <w:right w:val="none" w:color="FFFFFF" w:sz="0"/>
-            </w:tcBorders>
-            <w:tcMar>
-              <w:top w:type="dxa" w:w="40"/>
-              <w:left w:type="dxa" w:w="80"/>
-              <w:bottom w:type="dxa" w:w="40"/>
-              <w:right w:type="dxa" w:w="80"/>
-            </w:tcMar>
-            <w:vAlign w:val="center"/>
-          </w:tcPr>
-          <w:p>
-            <w:pPr>
-              <w:spacing w:line="240"/>
-              <w:jc w:val="center"/>
-            </w:pPr>
-            <w:r>
-              <w:rPr>
-                <w:rFonts w:ascii="Times New Roman" w:cs="Times New Roman" w:eastAsia="Times New Roman" w:hAnsi="Times New Roman"/>
-                <w:b w:val="false"/>
-                <w:bCs w:val="false"/>
-                <w:sz w:val="20"/>
-                <w:szCs w:val="20"/>
-              </w:rPr>
-              <w:t xml:space="preserve">No requiere</w:t>
+              <w:t xml:space="preserve">Calibración</w:t>
             </w:r>
           </w:p>
         </w:tc>
@@ -1437,11 +1373,11 @@
         </w:trPr>
         <w:tc>
           <w:tcPr>
-            <w:tcW w:type="dxa" w:w="2600"/>
+            <w:tcW w:type="dxa" w:w="2500"/>
             <w:tcBorders>
               <w:top w:val="none" w:color="FFFFFF" w:sz="0"/>
               <w:left w:val="none" w:color="FFFFFF" w:sz="0"/>
-              <w:bottom w:val="single" w:color="000000" w:sz="6"/>
+              <w:bottom w:val="none" w:color="FFFFFF" w:sz="0"/>
               <w:right w:val="none" w:color="FFFFFF" w:sz="0"/>
             </w:tcBorders>
             <w:tcMar>
@@ -1465,17 +1401,17 @@
                 <w:sz w:val="20"/>
                 <w:szCs w:val="20"/>
               </w:rPr>
-              <w:t xml:space="preserve">SVM lineal (Gloria Chushig)</w:t>
-            </w:r>
-          </w:p>
-        </w:tc>
-        <w:tc>
-          <w:tcPr>
-            <w:tcW w:type="dxa" w:w="4410"/>
+              <w:t xml:space="preserve">SVM polinómico (Alejandro Flores)</w:t>
+            </w:r>
+          </w:p>
+        </w:tc>
+        <w:tc>
+          <w:tcPr>
+            <w:tcW w:type="dxa" w:w="4610"/>
             <w:tcBorders>
               <w:top w:val="none" w:color="FFFFFF" w:sz="0"/>
               <w:left w:val="none" w:color="FFFFFF" w:sz="0"/>
-              <w:bottom w:val="single" w:color="000000" w:sz="6"/>
+              <w:bottom w:val="none" w:color="FFFFFF" w:sz="0"/>
               <w:right w:val="none" w:color="FFFFFF" w:sz="0"/>
             </w:tcBorders>
             <w:tcMar>
@@ -1497,8 +1433,32 @@
                 <w:sz w:val="17"/>
                 <w:szCs w:val="17"/>
               </w:rPr>
-              <w:t xml:space="preserve">LinearSVC(C=1.0, class_weight="balanced")</w:t>
-            </w:r>
+              <w:t xml:space="preserve">SVC(kernel="poly", degree=3, coef0=1, C=1.0, class_weight="balanced")</w:t>
+            </w:r>
+          </w:p>
+        </w:tc>
+        <w:tc>
+          <w:tcPr>
+            <w:tcW w:type="dxa" w:w="1400"/>
+            <w:tcBorders>
+              <w:top w:val="none" w:color="FFFFFF" w:sz="0"/>
+              <w:left w:val="none" w:color="FFFFFF" w:sz="0"/>
+              <w:bottom w:val="none" w:color="FFFFFF" w:sz="0"/>
+              <w:right w:val="none" w:color="FFFFFF" w:sz="0"/>
+            </w:tcBorders>
+            <w:tcMar>
+              <w:top w:type="dxa" w:w="40"/>
+              <w:left w:type="dxa" w:w="80"/>
+              <w:bottom w:type="dxa" w:w="40"/>
+              <w:right w:type="dxa" w:w="80"/>
+            </w:tcMar>
+            <w:vAlign w:val="center"/>
+          </w:tcPr>
+          <w:p>
+            <w:pPr>
+              <w:spacing w:line="240"/>
+              <w:jc w:val="center"/>
+            </w:pPr>
             <w:r>
               <w:rPr>
                 <w:rFonts w:ascii="Times New Roman" w:cs="Times New Roman" w:eastAsia="Times New Roman" w:hAnsi="Times New Roman"/>
@@ -1507,13 +1467,18 @@
                 <w:sz w:val="20"/>
                 <w:szCs w:val="20"/>
               </w:rPr>
-              <w:t xml:space="preserve"> calibrado (sigmoide, 5 particiones)</w:t>
-            </w:r>
-          </w:p>
-        </w:tc>
-        <w:tc>
-          <w:tcPr>
-            <w:tcW w:type="dxa" w:w="1500"/>
+              <w:t xml:space="preserve">Platt</w:t>
+            </w:r>
+          </w:p>
+        </w:tc>
+      </w:tr>
+      <w:tr>
+        <w:trPr>
+          <w:cantSplit/>
+        </w:trPr>
+        <w:tc>
+          <w:tcPr>
+            <w:tcW w:type="dxa" w:w="2500"/>
             <w:tcBorders>
               <w:top w:val="none" w:color="FFFFFF" w:sz="0"/>
               <w:left w:val="none" w:color="FFFFFF" w:sz="0"/>
@@ -1531,7 +1496,7 @@
           <w:p>
             <w:pPr>
               <w:spacing w:line="240"/>
-              <w:jc w:val="center"/>
+              <w:jc w:val="left"/>
             </w:pPr>
             <w:r>
               <w:rPr>
@@ -1541,7 +1506,73 @@
                 <w:sz w:val="20"/>
                 <w:szCs w:val="20"/>
               </w:rPr>
-              <w:t xml:space="preserve">StandardScaler</w:t>
+              <w:t xml:space="preserve">SVM gaussiano (Alejandro Flores)</w:t>
+            </w:r>
+          </w:p>
+        </w:tc>
+        <w:tc>
+          <w:tcPr>
+            <w:tcW w:type="dxa" w:w="4610"/>
+            <w:tcBorders>
+              <w:top w:val="none" w:color="FFFFFF" w:sz="0"/>
+              <w:left w:val="none" w:color="FFFFFF" w:sz="0"/>
+              <w:bottom w:val="single" w:color="000000" w:sz="6"/>
+              <w:right w:val="none" w:color="FFFFFF" w:sz="0"/>
+            </w:tcBorders>
+            <w:tcMar>
+              <w:top w:type="dxa" w:w="40"/>
+              <w:left w:type="dxa" w:w="80"/>
+              <w:bottom w:type="dxa" w:w="40"/>
+              <w:right w:type="dxa" w:w="80"/>
+            </w:tcMar>
+            <w:vAlign w:val="center"/>
+          </w:tcPr>
+          <w:p>
+            <w:pPr>
+              <w:spacing w:line="240"/>
+              <w:jc w:val="center"/>
+            </w:pPr>
+            <w:r>
+              <w:rPr>
+                <w:rFonts w:ascii="Courier New" w:cs="Courier New" w:eastAsia="Courier New" w:hAnsi="Courier New"/>
+                <w:sz w:val="17"/>
+                <w:szCs w:val="17"/>
+              </w:rPr>
+              <w:t xml:space="preserve">SVC(kernel="rbf", gamma="scale", C=1.0, class_weight="balanced")</w:t>
+            </w:r>
+          </w:p>
+        </w:tc>
+        <w:tc>
+          <w:tcPr>
+            <w:tcW w:type="dxa" w:w="1400"/>
+            <w:tcBorders>
+              <w:top w:val="none" w:color="FFFFFF" w:sz="0"/>
+              <w:left w:val="none" w:color="FFFFFF" w:sz="0"/>
+              <w:bottom w:val="single" w:color="000000" w:sz="6"/>
+              <w:right w:val="none" w:color="FFFFFF" w:sz="0"/>
+            </w:tcBorders>
+            <w:tcMar>
+              <w:top w:type="dxa" w:w="40"/>
+              <w:left w:type="dxa" w:w="80"/>
+              <w:bottom w:type="dxa" w:w="40"/>
+              <w:right w:type="dxa" w:w="80"/>
+            </w:tcMar>
+            <w:vAlign w:val="center"/>
+          </w:tcPr>
+          <w:p>
+            <w:pPr>
+              <w:spacing w:line="240"/>
+              <w:jc w:val="center"/>
+            </w:pPr>
+            <w:r>
+              <w:rPr>
+                <w:rFonts w:ascii="Times New Roman" w:cs="Times New Roman" w:eastAsia="Times New Roman" w:hAnsi="Times New Roman"/>
+                <w:b w:val="false"/>
+                <w:bCs w:val="false"/>
+                <w:sz w:val="20"/>
+                <w:szCs w:val="20"/>
+              </w:rPr>
+              <w:t xml:space="preserve">Platt</w:t>
             </w:r>
           </w:p>
         </w:tc>
@@ -1947,18 +1978,52 @@
             <w:r>
               <w:rPr>
                 <w:rFonts w:ascii="Times New Roman" w:cs="Times New Roman" w:eastAsia="Times New Roman" w:hAnsi="Times New Roman"/>
+                <w:b/>
+                <w:bCs/>
+                <w:sz w:val="20"/>
+                <w:szCs w:val="20"/>
+              </w:rPr>
+              <w:t xml:space="preserve">0,920</w:t>
+            </w:r>
+          </w:p>
+        </w:tc>
+        <w:tc>
+          <w:tcPr>
+            <w:tcW w:type="dxa" w:w="1000"/>
+            <w:tcBorders>
+              <w:top w:val="none" w:color="FFFFFF" w:sz="0"/>
+              <w:left w:val="none" w:color="FFFFFF" w:sz="0"/>
+              <w:bottom w:val="none" w:color="FFFFFF" w:sz="0"/>
+              <w:right w:val="none" w:color="FFFFFF" w:sz="0"/>
+            </w:tcBorders>
+            <w:tcMar>
+              <w:top w:type="dxa" w:w="40"/>
+              <w:left w:type="dxa" w:w="80"/>
+              <w:bottom w:type="dxa" w:w="40"/>
+              <w:right w:type="dxa" w:w="80"/>
+            </w:tcMar>
+            <w:vAlign w:val="center"/>
+          </w:tcPr>
+          <w:p>
+            <w:pPr>
+              <w:spacing w:line="240"/>
+              <w:jc w:val="center"/>
+            </w:pPr>
+            <w:r>
+              <w:rPr>
+                <w:rFonts w:ascii="Times New Roman" w:cs="Times New Roman" w:eastAsia="Times New Roman" w:hAnsi="Times New Roman"/>
                 <w:b w:val="false"/>
                 <w:bCs w:val="false"/>
                 <w:sz w:val="20"/>
                 <w:szCs w:val="20"/>
               </w:rPr>
-              <w:t xml:space="preserve">0,920</w:t>
-            </w:r>
-          </w:p>
-        </w:tc>
-        <w:tc>
-          <w:tcPr>
-            <w:tcW w:type="dxa" w:w="1000"/>
+              <w:t xml:space="preserve">0,686</w:t>
+            </w:r>
+          </w:p>
+        </w:tc>
+        <w:tc>
+          <w:tcPr>
+            <w:tcW w:type="dxa" w:w="760"/>
             <w:tcBorders>
               <w:top w:val="none" w:color="FFFFFF" w:sz="0"/>
               <w:left w:val="none" w:color="FFFFFF" w:sz="0"/>
@@ -1986,7 +2051,7 @@
                 <w:sz w:val="20"/>
                 <w:szCs w:val="20"/>
               </w:rPr>
-              <w:t xml:space="preserve">0,686</w:t>
+              <w:t xml:space="preserve">0,786</w:t>
             </w:r>
           </w:p>
         </w:tc>
@@ -2020,13 +2085,13 @@
                 <w:sz w:val="20"/>
                 <w:szCs w:val="20"/>
               </w:rPr>
-              <w:t xml:space="preserve">0,786</w:t>
-            </w:r>
-          </w:p>
-        </w:tc>
-        <w:tc>
-          <w:tcPr>
-            <w:tcW w:type="dxa" w:w="760"/>
+              <w:t xml:space="preserve">0,977</w:t>
+            </w:r>
+          </w:p>
+        </w:tc>
+        <w:tc>
+          <w:tcPr>
+            <w:tcW w:type="dxa" w:w="1000"/>
             <w:tcBorders>
               <w:top w:val="none" w:color="FFFFFF" w:sz="0"/>
               <w:left w:val="none" w:color="FFFFFF" w:sz="0"/>
@@ -2054,13 +2119,13 @@
                 <w:sz w:val="20"/>
                 <w:szCs w:val="20"/>
               </w:rPr>
-              <w:t xml:space="preserve">0,977</w:t>
-            </w:r>
-          </w:p>
-        </w:tc>
-        <w:tc>
-          <w:tcPr>
-            <w:tcW w:type="dxa" w:w="1000"/>
+              <w:t xml:space="preserve">0,928</w:t>
+            </w:r>
+          </w:p>
+        </w:tc>
+        <w:tc>
+          <w:tcPr>
+            <w:tcW w:type="dxa" w:w="900"/>
             <w:tcBorders>
               <w:top w:val="none" w:color="FFFFFF" w:sz="0"/>
               <w:left w:val="none" w:color="FFFFFF" w:sz="0"/>
@@ -2083,42 +2148,8 @@
             <w:r>
               <w:rPr>
                 <w:rFonts w:ascii="Times New Roman" w:cs="Times New Roman" w:eastAsia="Times New Roman" w:hAnsi="Times New Roman"/>
-                <w:b w:val="false"/>
-                <w:bCs w:val="false"/>
-                <w:sz w:val="20"/>
-                <w:szCs w:val="20"/>
-              </w:rPr>
-              <w:t xml:space="preserve">0,928</w:t>
-            </w:r>
-          </w:p>
-        </w:tc>
-        <w:tc>
-          <w:tcPr>
-            <w:tcW w:type="dxa" w:w="900"/>
-            <w:tcBorders>
-              <w:top w:val="none" w:color="FFFFFF" w:sz="0"/>
-              <w:left w:val="none" w:color="FFFFFF" w:sz="0"/>
-              <w:bottom w:val="none" w:color="FFFFFF" w:sz="0"/>
-              <w:right w:val="none" w:color="FFFFFF" w:sz="0"/>
-            </w:tcBorders>
-            <w:tcMar>
-              <w:top w:type="dxa" w:w="40"/>
-              <w:left w:type="dxa" w:w="80"/>
-              <w:bottom w:type="dxa" w:w="40"/>
-              <w:right w:type="dxa" w:w="80"/>
-            </w:tcMar>
-            <w:vAlign w:val="center"/>
-          </w:tcPr>
-          <w:p>
-            <w:pPr>
-              <w:spacing w:line="240"/>
-              <w:jc w:val="center"/>
-            </w:pPr>
-            <w:r>
-              <w:rPr>
-                <w:rFonts w:ascii="Times New Roman" w:cs="Times New Roman" w:eastAsia="Times New Roman" w:hAnsi="Times New Roman"/>
-                <w:b w:val="false"/>
-                <w:bCs w:val="false"/>
+                <w:b/>
+                <w:bCs/>
                 <w:sz w:val="20"/>
                 <w:szCs w:val="20"/>
               </w:rPr>
@@ -2174,7 +2205,6 @@
               <w:bottom w:val="none" w:color="FFFFFF" w:sz="0"/>
               <w:right w:val="none" w:color="FFFFFF" w:sz="0"/>
             </w:tcBorders>
-            <w:shd w:fill="EAF2FB" w:color="auto" w:val="clear"/>
             <w:tcMar>
               <w:top w:type="dxa" w:w="40"/>
               <w:left w:type="dxa" w:w="80"/>
@@ -2187,76 +2217,6 @@
             <w:pPr>
               <w:spacing w:line="240"/>
               <w:jc w:val="left"/>
-            </w:pPr>
-            <w:r>
-              <w:rPr>
-                <w:rFonts w:ascii="Times New Roman" w:cs="Times New Roman" w:eastAsia="Times New Roman" w:hAnsi="Times New Roman"/>
-                <w:b/>
-                <w:bCs/>
-                <w:sz w:val="20"/>
-                <w:szCs w:val="20"/>
-              </w:rPr>
-              <w:t xml:space="preserve">Random Forest</w:t>
-            </w:r>
-          </w:p>
-        </w:tc>
-        <w:tc>
-          <w:tcPr>
-            <w:tcW w:type="dxa" w:w="860"/>
-            <w:tcBorders>
-              <w:top w:val="none" w:color="FFFFFF" w:sz="0"/>
-              <w:left w:val="none" w:color="FFFFFF" w:sz="0"/>
-              <w:bottom w:val="none" w:color="FFFFFF" w:sz="0"/>
-              <w:right w:val="none" w:color="FFFFFF" w:sz="0"/>
-            </w:tcBorders>
-            <w:shd w:fill="EAF2FB" w:color="auto" w:val="clear"/>
-            <w:tcMar>
-              <w:top w:type="dxa" w:w="40"/>
-              <w:left w:type="dxa" w:w="80"/>
-              <w:bottom w:type="dxa" w:w="40"/>
-              <w:right w:type="dxa" w:w="80"/>
-            </w:tcMar>
-            <w:vAlign w:val="center"/>
-          </w:tcPr>
-          <w:p>
-            <w:pPr>
-              <w:spacing w:line="240"/>
-              <w:jc w:val="center"/>
-            </w:pPr>
-            <w:r>
-              <w:rPr>
-                <w:rFonts w:ascii="Times New Roman" w:cs="Times New Roman" w:eastAsia="Times New Roman" w:hAnsi="Times New Roman"/>
-                <w:b/>
-                <w:bCs/>
-                <w:sz w:val="20"/>
-                <w:szCs w:val="20"/>
-              </w:rPr>
-              <w:t xml:space="preserve">0,947</w:t>
-            </w:r>
-          </w:p>
-        </w:tc>
-        <w:tc>
-          <w:tcPr>
-            <w:tcW w:type="dxa" w:w="1000"/>
-            <w:tcBorders>
-              <w:top w:val="none" w:color="FFFFFF" w:sz="0"/>
-              <w:left w:val="none" w:color="FFFFFF" w:sz="0"/>
-              <w:bottom w:val="none" w:color="FFFFFF" w:sz="0"/>
-              <w:right w:val="none" w:color="FFFFFF" w:sz="0"/>
-            </w:tcBorders>
-            <w:shd w:fill="EAF2FB" w:color="auto" w:val="clear"/>
-            <w:tcMar>
-              <w:top w:type="dxa" w:w="40"/>
-              <w:left w:type="dxa" w:w="80"/>
-              <w:bottom w:type="dxa" w:w="40"/>
-              <w:right w:type="dxa" w:w="80"/>
-            </w:tcMar>
-            <w:vAlign w:val="center"/>
-          </w:tcPr>
-          <w:p>
-            <w:pPr>
-              <w:spacing w:line="240"/>
-              <w:jc w:val="center"/>
             </w:pPr>
             <w:r>
               <w:rPr>
@@ -2266,160 +2226,19 @@
                 <w:sz w:val="20"/>
                 <w:szCs w:val="20"/>
               </w:rPr>
-              <w:t xml:space="preserve">0,894</w:t>
-            </w:r>
-          </w:p>
-        </w:tc>
-        <w:tc>
-          <w:tcPr>
-            <w:tcW w:type="dxa" w:w="760"/>
+              <w:t xml:space="preserve">SVM lineal</w:t>
+            </w:r>
+          </w:p>
+        </w:tc>
+        <w:tc>
+          <w:tcPr>
+            <w:tcW w:type="dxa" w:w="860"/>
             <w:tcBorders>
               <w:top w:val="none" w:color="FFFFFF" w:sz="0"/>
               <w:left w:val="none" w:color="FFFFFF" w:sz="0"/>
               <w:bottom w:val="none" w:color="FFFFFF" w:sz="0"/>
               <w:right w:val="none" w:color="FFFFFF" w:sz="0"/>
             </w:tcBorders>
-            <w:shd w:fill="EAF2FB" w:color="auto" w:val="clear"/>
-            <w:tcMar>
-              <w:top w:type="dxa" w:w="40"/>
-              <w:left w:type="dxa" w:w="80"/>
-              <w:bottom w:type="dxa" w:w="40"/>
-              <w:right w:type="dxa" w:w="80"/>
-            </w:tcMar>
-            <w:vAlign w:val="center"/>
-          </w:tcPr>
-          <w:p>
-            <w:pPr>
-              <w:spacing w:line="240"/>
-              <w:jc w:val="center"/>
-            </w:pPr>
-            <w:r>
-              <w:rPr>
-                <w:rFonts w:ascii="Times New Roman" w:cs="Times New Roman" w:eastAsia="Times New Roman" w:hAnsi="Times New Roman"/>
-                <w:b/>
-                <w:bCs/>
-                <w:sz w:val="20"/>
-                <w:szCs w:val="20"/>
-              </w:rPr>
-              <w:t xml:space="preserve">0,920</w:t>
-            </w:r>
-          </w:p>
-        </w:tc>
-        <w:tc>
-          <w:tcPr>
-            <w:tcW w:type="dxa" w:w="760"/>
-            <w:tcBorders>
-              <w:top w:val="none" w:color="FFFFFF" w:sz="0"/>
-              <w:left w:val="none" w:color="FFFFFF" w:sz="0"/>
-              <w:bottom w:val="none" w:color="FFFFFF" w:sz="0"/>
-              <w:right w:val="none" w:color="FFFFFF" w:sz="0"/>
-            </w:tcBorders>
-            <w:shd w:fill="EAF2FB" w:color="auto" w:val="clear"/>
-            <w:tcMar>
-              <w:top w:type="dxa" w:w="40"/>
-              <w:left w:type="dxa" w:w="80"/>
-              <w:bottom w:type="dxa" w:w="40"/>
-              <w:right w:type="dxa" w:w="80"/>
-            </w:tcMar>
-            <w:vAlign w:val="center"/>
-          </w:tcPr>
-          <w:p>
-            <w:pPr>
-              <w:spacing w:line="240"/>
-              <w:jc w:val="center"/>
-            </w:pPr>
-            <w:r>
-              <w:rPr>
-                <w:rFonts w:ascii="Times New Roman" w:cs="Times New Roman" w:eastAsia="Times New Roman" w:hAnsi="Times New Roman"/>
-                <w:b/>
-                <w:bCs/>
-                <w:sz w:val="20"/>
-                <w:szCs w:val="20"/>
-              </w:rPr>
-              <w:t xml:space="preserve">0,993</w:t>
-            </w:r>
-          </w:p>
-        </w:tc>
-        <w:tc>
-          <w:tcPr>
-            <w:tcW w:type="dxa" w:w="1000"/>
-            <w:tcBorders>
-              <w:top w:val="none" w:color="FFFFFF" w:sz="0"/>
-              <w:left w:val="none" w:color="FFFFFF" w:sz="0"/>
-              <w:bottom w:val="none" w:color="FFFFFF" w:sz="0"/>
-              <w:right w:val="none" w:color="FFFFFF" w:sz="0"/>
-            </w:tcBorders>
-            <w:shd w:fill="EAF2FB" w:color="auto" w:val="clear"/>
-            <w:tcMar>
-              <w:top w:type="dxa" w:w="40"/>
-              <w:left w:type="dxa" w:w="80"/>
-              <w:bottom w:type="dxa" w:w="40"/>
-              <w:right w:type="dxa" w:w="80"/>
-            </w:tcMar>
-            <w:vAlign w:val="center"/>
-          </w:tcPr>
-          <w:p>
-            <w:pPr>
-              <w:spacing w:line="240"/>
-              <w:jc w:val="center"/>
-            </w:pPr>
-            <w:r>
-              <w:rPr>
-                <w:rFonts w:ascii="Times New Roman" w:cs="Times New Roman" w:eastAsia="Times New Roman" w:hAnsi="Times New Roman"/>
-                <w:b/>
-                <w:bCs/>
-                <w:sz w:val="20"/>
-                <w:szCs w:val="20"/>
-              </w:rPr>
-              <w:t xml:space="preserve">0,976</w:t>
-            </w:r>
-          </w:p>
-        </w:tc>
-        <w:tc>
-          <w:tcPr>
-            <w:tcW w:type="dxa" w:w="900"/>
-            <w:tcBorders>
-              <w:top w:val="none" w:color="FFFFFF" w:sz="0"/>
-              <w:left w:val="none" w:color="FFFFFF" w:sz="0"/>
-              <w:bottom w:val="none" w:color="FFFFFF" w:sz="0"/>
-              <w:right w:val="none" w:color="FFFFFF" w:sz="0"/>
-            </w:tcBorders>
-            <w:shd w:fill="EAF2FB" w:color="auto" w:val="clear"/>
-            <w:tcMar>
-              <w:top w:type="dxa" w:w="40"/>
-              <w:left w:type="dxa" w:w="80"/>
-              <w:bottom w:type="dxa" w:w="40"/>
-              <w:right w:type="dxa" w:w="80"/>
-            </w:tcMar>
-            <w:vAlign w:val="center"/>
-          </w:tcPr>
-          <w:p>
-            <w:pPr>
-              <w:spacing w:line="240"/>
-              <w:jc w:val="center"/>
-            </w:pPr>
-            <w:r>
-              <w:rPr>
-                <w:rFonts w:ascii="Times New Roman" w:cs="Times New Roman" w:eastAsia="Times New Roman" w:hAnsi="Times New Roman"/>
-                <w:b/>
-                <w:bCs/>
-                <w:sz w:val="20"/>
-                <w:szCs w:val="20"/>
-              </w:rPr>
-              <w:t xml:space="preserve">176</w:t>
-            </w:r>
-          </w:p>
-        </w:tc>
-        <w:tc>
-          <w:tcPr>
-            <w:tcW w:type="dxa" w:w="1000"/>
-            <w:tcBorders>
-              <w:top w:val="none" w:color="FFFFFF" w:sz="0"/>
-              <w:left w:val="none" w:color="FFFFFF" w:sz="0"/>
-              <w:bottom w:val="none" w:color="FFFFFF" w:sz="0"/>
-              <w:right w:val="none" w:color="FFFFFF" w:sz="0"/>
-            </w:tcBorders>
-            <w:shd w:fill="EAF2FB" w:color="auto" w:val="clear"/>
             <w:tcMar>
               <w:top w:type="dxa" w:w="40"/>
               <w:left w:type="dxa" w:w="80"/>
@@ -2441,7 +2260,211 @@
                 <w:sz w:val="20"/>
                 <w:szCs w:val="20"/>
               </w:rPr>
-              <w:t xml:space="preserve">372</w:t>
+              <w:t xml:space="preserve">0,758</w:t>
+            </w:r>
+          </w:p>
+        </w:tc>
+        <w:tc>
+          <w:tcPr>
+            <w:tcW w:type="dxa" w:w="1000"/>
+            <w:tcBorders>
+              <w:top w:val="none" w:color="FFFFFF" w:sz="0"/>
+              <w:left w:val="none" w:color="FFFFFF" w:sz="0"/>
+              <w:bottom w:val="none" w:color="FFFFFF" w:sz="0"/>
+              <w:right w:val="none" w:color="FFFFFF" w:sz="0"/>
+            </w:tcBorders>
+            <w:tcMar>
+              <w:top w:type="dxa" w:w="40"/>
+              <w:left w:type="dxa" w:w="80"/>
+              <w:bottom w:type="dxa" w:w="40"/>
+              <w:right w:type="dxa" w:w="80"/>
+            </w:tcMar>
+            <w:vAlign w:val="center"/>
+          </w:tcPr>
+          <w:p>
+            <w:pPr>
+              <w:spacing w:line="240"/>
+              <w:jc w:val="center"/>
+            </w:pPr>
+            <w:r>
+              <w:rPr>
+                <w:rFonts w:ascii="Times New Roman" w:cs="Times New Roman" w:eastAsia="Times New Roman" w:hAnsi="Times New Roman"/>
+                <w:b w:val="false"/>
+                <w:bCs w:val="false"/>
+                <w:sz w:val="20"/>
+                <w:szCs w:val="20"/>
+              </w:rPr>
+              <w:t xml:space="preserve">0,910</w:t>
+            </w:r>
+          </w:p>
+        </w:tc>
+        <w:tc>
+          <w:tcPr>
+            <w:tcW w:type="dxa" w:w="760"/>
+            <w:tcBorders>
+              <w:top w:val="none" w:color="FFFFFF" w:sz="0"/>
+              <w:left w:val="none" w:color="FFFFFF" w:sz="0"/>
+              <w:bottom w:val="none" w:color="FFFFFF" w:sz="0"/>
+              <w:right w:val="none" w:color="FFFFFF" w:sz="0"/>
+            </w:tcBorders>
+            <w:tcMar>
+              <w:top w:type="dxa" w:w="40"/>
+              <w:left w:type="dxa" w:w="80"/>
+              <w:bottom w:type="dxa" w:w="40"/>
+              <w:right w:type="dxa" w:w="80"/>
+            </w:tcMar>
+            <w:vAlign w:val="center"/>
+          </w:tcPr>
+          <w:p>
+            <w:pPr>
+              <w:spacing w:line="240"/>
+              <w:jc w:val="center"/>
+            </w:pPr>
+            <w:r>
+              <w:rPr>
+                <w:rFonts w:ascii="Times New Roman" w:cs="Times New Roman" w:eastAsia="Times New Roman" w:hAnsi="Times New Roman"/>
+                <w:b w:val="false"/>
+                <w:bCs w:val="false"/>
+                <w:sz w:val="20"/>
+                <w:szCs w:val="20"/>
+              </w:rPr>
+              <w:t xml:space="preserve">0,827</w:t>
+            </w:r>
+          </w:p>
+        </w:tc>
+        <w:tc>
+          <w:tcPr>
+            <w:tcW w:type="dxa" w:w="760"/>
+            <w:tcBorders>
+              <w:top w:val="none" w:color="FFFFFF" w:sz="0"/>
+              <w:left w:val="none" w:color="FFFFFF" w:sz="0"/>
+              <w:bottom w:val="none" w:color="FFFFFF" w:sz="0"/>
+              <w:right w:val="none" w:color="FFFFFF" w:sz="0"/>
+            </w:tcBorders>
+            <w:tcMar>
+              <w:top w:type="dxa" w:w="40"/>
+              <w:left w:type="dxa" w:w="80"/>
+              <w:bottom w:type="dxa" w:w="40"/>
+              <w:right w:type="dxa" w:w="80"/>
+            </w:tcMar>
+            <w:vAlign w:val="center"/>
+          </w:tcPr>
+          <w:p>
+            <w:pPr>
+              <w:spacing w:line="240"/>
+              <w:jc w:val="center"/>
+            </w:pPr>
+            <w:r>
+              <w:rPr>
+                <w:rFonts w:ascii="Times New Roman" w:cs="Times New Roman" w:eastAsia="Times New Roman" w:hAnsi="Times New Roman"/>
+                <w:b w:val="false"/>
+                <w:bCs w:val="false"/>
+                <w:sz w:val="20"/>
+                <w:szCs w:val="20"/>
+              </w:rPr>
+              <w:t xml:space="preserve">0,976</w:t>
+            </w:r>
+          </w:p>
+        </w:tc>
+        <w:tc>
+          <w:tcPr>
+            <w:tcW w:type="dxa" w:w="1000"/>
+            <w:tcBorders>
+              <w:top w:val="none" w:color="FFFFFF" w:sz="0"/>
+              <w:left w:val="none" w:color="FFFFFF" w:sz="0"/>
+              <w:bottom w:val="none" w:color="FFFFFF" w:sz="0"/>
+              <w:right w:val="none" w:color="FFFFFF" w:sz="0"/>
+            </w:tcBorders>
+            <w:tcMar>
+              <w:top w:type="dxa" w:w="40"/>
+              <w:left w:type="dxa" w:w="80"/>
+              <w:bottom w:type="dxa" w:w="40"/>
+              <w:right w:type="dxa" w:w="80"/>
+            </w:tcMar>
+            <w:vAlign w:val="center"/>
+          </w:tcPr>
+          <w:p>
+            <w:pPr>
+              <w:spacing w:line="240"/>
+              <w:jc w:val="center"/>
+            </w:pPr>
+            <w:r>
+              <w:rPr>
+                <w:rFonts w:ascii="Times New Roman" w:cs="Times New Roman" w:eastAsia="Times New Roman" w:hAnsi="Times New Roman"/>
+                <w:b w:val="false"/>
+                <w:bCs w:val="false"/>
+                <w:sz w:val="20"/>
+                <w:szCs w:val="20"/>
+              </w:rPr>
+              <w:t xml:space="preserve">0,954</w:t>
+            </w:r>
+          </w:p>
+        </w:tc>
+        <w:tc>
+          <w:tcPr>
+            <w:tcW w:type="dxa" w:w="900"/>
+            <w:tcBorders>
+              <w:top w:val="none" w:color="FFFFFF" w:sz="0"/>
+              <w:left w:val="none" w:color="FFFFFF" w:sz="0"/>
+              <w:bottom w:val="none" w:color="FFFFFF" w:sz="0"/>
+              <w:right w:val="none" w:color="FFFFFF" w:sz="0"/>
+            </w:tcBorders>
+            <w:tcMar>
+              <w:top w:type="dxa" w:w="40"/>
+              <w:left w:type="dxa" w:w="80"/>
+              <w:bottom w:type="dxa" w:w="40"/>
+              <w:right w:type="dxa" w:w="80"/>
+            </w:tcMar>
+            <w:vAlign w:val="center"/>
+          </w:tcPr>
+          <w:p>
+            <w:pPr>
+              <w:spacing w:line="240"/>
+              <w:jc w:val="center"/>
+            </w:pPr>
+            <w:r>
+              <w:rPr>
+                <w:rFonts w:ascii="Times New Roman" w:cs="Times New Roman" w:eastAsia="Times New Roman" w:hAnsi="Times New Roman"/>
+                <w:b w:val="false"/>
+                <w:bCs w:val="false"/>
+                <w:sz w:val="20"/>
+                <w:szCs w:val="20"/>
+              </w:rPr>
+              <w:t xml:space="preserve">803</w:t>
+            </w:r>
+          </w:p>
+        </w:tc>
+        <w:tc>
+          <w:tcPr>
+            <w:tcW w:type="dxa" w:w="1000"/>
+            <w:tcBorders>
+              <w:top w:val="none" w:color="FFFFFF" w:sz="0"/>
+              <w:left w:val="none" w:color="FFFFFF" w:sz="0"/>
+              <w:bottom w:val="none" w:color="FFFFFF" w:sz="0"/>
+              <w:right w:val="none" w:color="FFFFFF" w:sz="0"/>
+            </w:tcBorders>
+            <w:tcMar>
+              <w:top w:type="dxa" w:w="40"/>
+              <w:left w:type="dxa" w:w="80"/>
+              <w:bottom w:type="dxa" w:w="40"/>
+              <w:right w:type="dxa" w:w="80"/>
+            </w:tcMar>
+            <w:vAlign w:val="center"/>
+          </w:tcPr>
+          <w:p>
+            <w:pPr>
+              <w:spacing w:line="240"/>
+              <w:jc w:val="center"/>
+            </w:pPr>
+            <w:r>
+              <w:rPr>
+                <w:rFonts w:ascii="Times New Roman" w:cs="Times New Roman" w:eastAsia="Times New Roman" w:hAnsi="Times New Roman"/>
+                <w:b w:val="false"/>
+                <w:bCs w:val="false"/>
+                <w:sz w:val="20"/>
+                <w:szCs w:val="20"/>
+              </w:rPr>
+              <w:t xml:space="preserve">248</w:t>
             </w:r>
           </w:p>
         </w:tc>
@@ -2456,7 +2479,7 @@
             <w:tcBorders>
               <w:top w:val="none" w:color="FFFFFF" w:sz="0"/>
               <w:left w:val="none" w:color="FFFFFF" w:sz="0"/>
-              <w:bottom w:val="single" w:color="000000" w:sz="6"/>
+              <w:bottom w:val="none" w:color="FFFFFF" w:sz="0"/>
               <w:right w:val="none" w:color="FFFFFF" w:sz="0"/>
             </w:tcBorders>
             <w:tcMar>
@@ -2480,7 +2503,7 @@
                 <w:sz w:val="20"/>
                 <w:szCs w:val="20"/>
               </w:rPr>
-              <w:t xml:space="preserve">SVM lineal</w:t>
+              <w:t xml:space="preserve">SVM polinómico</w:t>
             </w:r>
           </w:p>
         </w:tc>
@@ -2490,7 +2513,7 @@
             <w:tcBorders>
               <w:top w:val="none" w:color="FFFFFF" w:sz="0"/>
               <w:left w:val="none" w:color="FFFFFF" w:sz="0"/>
-              <w:bottom w:val="single" w:color="000000" w:sz="6"/>
+              <w:bottom w:val="none" w:color="FFFFFF" w:sz="0"/>
               <w:right w:val="none" w:color="FFFFFF" w:sz="0"/>
             </w:tcBorders>
             <w:tcMar>
@@ -2514,7 +2537,7 @@
                 <w:sz w:val="20"/>
                 <w:szCs w:val="20"/>
               </w:rPr>
-              <w:t xml:space="preserve">0,758</w:t>
+              <w:t xml:space="preserve">0,862</w:t>
             </w:r>
           </w:p>
         </w:tc>
@@ -2524,7 +2547,7 @@
             <w:tcBorders>
               <w:top w:val="none" w:color="FFFFFF" w:sz="0"/>
               <w:left w:val="none" w:color="FFFFFF" w:sz="0"/>
-              <w:bottom w:val="single" w:color="000000" w:sz="6"/>
+              <w:bottom w:val="none" w:color="FFFFFF" w:sz="0"/>
               <w:right w:val="none" w:color="FFFFFF" w:sz="0"/>
             </w:tcBorders>
             <w:tcMar>
@@ -2548,7 +2571,7 @@
                 <w:sz w:val="20"/>
                 <w:szCs w:val="20"/>
               </w:rPr>
-              <w:t xml:space="preserve">0,910</w:t>
+              <w:t xml:space="preserve">0,940</w:t>
             </w:r>
           </w:p>
         </w:tc>
@@ -2558,7 +2581,7 @@
             <w:tcBorders>
               <w:top w:val="none" w:color="FFFFFF" w:sz="0"/>
               <w:left w:val="none" w:color="FFFFFF" w:sz="0"/>
-              <w:bottom w:val="single" w:color="000000" w:sz="6"/>
+              <w:bottom w:val="none" w:color="FFFFFF" w:sz="0"/>
               <w:right w:val="none" w:color="FFFFFF" w:sz="0"/>
             </w:tcBorders>
             <w:tcMar>
@@ -2582,7 +2605,7 @@
                 <w:sz w:val="20"/>
                 <w:szCs w:val="20"/>
               </w:rPr>
-              <w:t xml:space="preserve">0,827</w:t>
+              <w:t xml:space="preserve">0,899</w:t>
             </w:r>
           </w:p>
         </w:tc>
@@ -2592,7 +2615,7 @@
             <w:tcBorders>
               <w:top w:val="none" w:color="FFFFFF" w:sz="0"/>
               <w:left w:val="none" w:color="FFFFFF" w:sz="0"/>
-              <w:bottom w:val="single" w:color="000000" w:sz="6"/>
+              <w:bottom w:val="none" w:color="FFFFFF" w:sz="0"/>
               <w:right w:val="none" w:color="FFFFFF" w:sz="0"/>
             </w:tcBorders>
             <w:tcMar>
@@ -2616,7 +2639,7 @@
                 <w:sz w:val="20"/>
                 <w:szCs w:val="20"/>
               </w:rPr>
-              <w:t xml:space="preserve">0,976</w:t>
+              <w:t xml:space="preserve">0,990</w:t>
             </w:r>
           </w:p>
         </w:tc>
@@ -2626,7 +2649,7 @@
             <w:tcBorders>
               <w:top w:val="none" w:color="FFFFFF" w:sz="0"/>
               <w:left w:val="none" w:color="FFFFFF" w:sz="0"/>
-              <w:bottom w:val="single" w:color="000000" w:sz="6"/>
+              <w:bottom w:val="none" w:color="FFFFFF" w:sz="0"/>
               <w:right w:val="none" w:color="FFFFFF" w:sz="0"/>
             </w:tcBorders>
             <w:tcMar>
@@ -2650,7 +2673,7 @@
                 <w:sz w:val="20"/>
                 <w:szCs w:val="20"/>
               </w:rPr>
-              <w:t xml:space="preserve">0,954</w:t>
+              <w:t xml:space="preserve">0,972</w:t>
             </w:r>
           </w:p>
         </w:tc>
@@ -2660,7 +2683,7 @@
             <w:tcBorders>
               <w:top w:val="none" w:color="FFFFFF" w:sz="0"/>
               <w:left w:val="none" w:color="FFFFFF" w:sz="0"/>
-              <w:bottom w:val="single" w:color="000000" w:sz="6"/>
+              <w:bottom w:val="none" w:color="FFFFFF" w:sz="0"/>
               <w:right w:val="none" w:color="FFFFFF" w:sz="0"/>
             </w:tcBorders>
             <w:tcMar>
@@ -2684,7 +2707,7 @@
                 <w:sz w:val="20"/>
                 <w:szCs w:val="20"/>
               </w:rPr>
-              <w:t xml:space="preserve">803</w:t>
+              <w:t xml:space="preserve">459</w:t>
             </w:r>
           </w:p>
         </w:tc>
@@ -2694,7 +2717,7 @@
             <w:tcBorders>
               <w:top w:val="none" w:color="FFFFFF" w:sz="0"/>
               <w:left w:val="none" w:color="FFFFFF" w:sz="0"/>
-              <w:bottom w:val="single" w:color="000000" w:sz="6"/>
+              <w:bottom w:val="none" w:color="FFFFFF" w:sz="0"/>
               <w:right w:val="none" w:color="FFFFFF" w:sz="0"/>
             </w:tcBorders>
             <w:tcMar>
@@ -2718,7 +2741,292 @@
                 <w:sz w:val="20"/>
                 <w:szCs w:val="20"/>
               </w:rPr>
-              <w:t xml:space="preserve">248</w:t>
+              <w:t xml:space="preserve">182</w:t>
+            </w:r>
+          </w:p>
+        </w:tc>
+      </w:tr>
+      <w:tr>
+        <w:trPr>
+          <w:cantSplit/>
+        </w:trPr>
+        <w:tc>
+          <w:tcPr>
+            <w:tcW w:type="dxa" w:w="2230"/>
+            <w:tcBorders>
+              <w:top w:val="none" w:color="FFFFFF" w:sz="0"/>
+              <w:left w:val="none" w:color="FFFFFF" w:sz="0"/>
+              <w:bottom w:val="single" w:color="000000" w:sz="6"/>
+              <w:right w:val="none" w:color="FFFFFF" w:sz="0"/>
+            </w:tcBorders>
+            <w:shd w:fill="EAF2FB" w:color="auto" w:val="clear"/>
+            <w:tcMar>
+              <w:top w:type="dxa" w:w="40"/>
+              <w:left w:type="dxa" w:w="80"/>
+              <w:bottom w:type="dxa" w:w="40"/>
+              <w:right w:type="dxa" w:w="80"/>
+            </w:tcMar>
+            <w:vAlign w:val="center"/>
+          </w:tcPr>
+          <w:p>
+            <w:pPr>
+              <w:spacing w:line="240"/>
+              <w:jc w:val="left"/>
+            </w:pPr>
+            <w:r>
+              <w:rPr>
+                <w:rFonts w:ascii="Times New Roman" w:cs="Times New Roman" w:eastAsia="Times New Roman" w:hAnsi="Times New Roman"/>
+                <w:b/>
+                <w:bCs/>
+                <w:sz w:val="20"/>
+                <w:szCs w:val="20"/>
+              </w:rPr>
+              <w:t xml:space="preserve">SVM gaussiano</w:t>
+            </w:r>
+          </w:p>
+        </w:tc>
+        <w:tc>
+          <w:tcPr>
+            <w:tcW w:type="dxa" w:w="860"/>
+            <w:tcBorders>
+              <w:top w:val="none" w:color="FFFFFF" w:sz="0"/>
+              <w:left w:val="none" w:color="FFFFFF" w:sz="0"/>
+              <w:bottom w:val="single" w:color="000000" w:sz="6"/>
+              <w:right w:val="none" w:color="FFFFFF" w:sz="0"/>
+            </w:tcBorders>
+            <w:shd w:fill="EAF2FB" w:color="auto" w:val="clear"/>
+            <w:tcMar>
+              <w:top w:type="dxa" w:w="40"/>
+              <w:left w:type="dxa" w:w="80"/>
+              <w:bottom w:type="dxa" w:w="40"/>
+              <w:right w:type="dxa" w:w="80"/>
+            </w:tcMar>
+            <w:vAlign w:val="center"/>
+          </w:tcPr>
+          <w:p>
+            <w:pPr>
+              <w:spacing w:line="240"/>
+              <w:jc w:val="center"/>
+            </w:pPr>
+            <w:r>
+              <w:rPr>
+                <w:rFonts w:ascii="Times New Roman" w:cs="Times New Roman" w:eastAsia="Times New Roman" w:hAnsi="Times New Roman"/>
+                <w:b w:val="false"/>
+                <w:bCs w:val="false"/>
+                <w:sz w:val="20"/>
+                <w:szCs w:val="20"/>
+              </w:rPr>
+              <w:t xml:space="preserve">0,903</w:t>
+            </w:r>
+          </w:p>
+        </w:tc>
+        <w:tc>
+          <w:tcPr>
+            <w:tcW w:type="dxa" w:w="1000"/>
+            <w:tcBorders>
+              <w:top w:val="none" w:color="FFFFFF" w:sz="0"/>
+              <w:left w:val="none" w:color="FFFFFF" w:sz="0"/>
+              <w:bottom w:val="single" w:color="000000" w:sz="6"/>
+              <w:right w:val="none" w:color="FFFFFF" w:sz="0"/>
+            </w:tcBorders>
+            <w:shd w:fill="EAF2FB" w:color="auto" w:val="clear"/>
+            <w:tcMar>
+              <w:top w:type="dxa" w:w="40"/>
+              <w:left w:type="dxa" w:w="80"/>
+              <w:bottom w:type="dxa" w:w="40"/>
+              <w:right w:type="dxa" w:w="80"/>
+            </w:tcMar>
+            <w:vAlign w:val="center"/>
+          </w:tcPr>
+          <w:p>
+            <w:pPr>
+              <w:spacing w:line="240"/>
+              <w:jc w:val="center"/>
+            </w:pPr>
+            <w:r>
+              <w:rPr>
+                <w:rFonts w:ascii="Times New Roman" w:cs="Times New Roman" w:eastAsia="Times New Roman" w:hAnsi="Times New Roman"/>
+                <w:b w:val="false"/>
+                <w:bCs w:val="false"/>
+                <w:sz w:val="20"/>
+                <w:szCs w:val="20"/>
+              </w:rPr>
+              <w:t xml:space="preserve">0,915</w:t>
+            </w:r>
+          </w:p>
+        </w:tc>
+        <w:tc>
+          <w:tcPr>
+            <w:tcW w:type="dxa" w:w="760"/>
+            <w:tcBorders>
+              <w:top w:val="none" w:color="FFFFFF" w:sz="0"/>
+              <w:left w:val="none" w:color="FFFFFF" w:sz="0"/>
+              <w:bottom w:val="single" w:color="000000" w:sz="6"/>
+              <w:right w:val="none" w:color="FFFFFF" w:sz="0"/>
+            </w:tcBorders>
+            <w:shd w:fill="EAF2FB" w:color="auto" w:val="clear"/>
+            <w:tcMar>
+              <w:top w:type="dxa" w:w="40"/>
+              <w:left w:type="dxa" w:w="80"/>
+              <w:bottom w:type="dxa" w:w="40"/>
+              <w:right w:type="dxa" w:w="80"/>
+            </w:tcMar>
+            <w:vAlign w:val="center"/>
+          </w:tcPr>
+          <w:p>
+            <w:pPr>
+              <w:spacing w:line="240"/>
+              <w:jc w:val="center"/>
+            </w:pPr>
+            <w:r>
+              <w:rPr>
+                <w:rFonts w:ascii="Times New Roman" w:cs="Times New Roman" w:eastAsia="Times New Roman" w:hAnsi="Times New Roman"/>
+                <w:b/>
+                <w:bCs/>
+                <w:sz w:val="20"/>
+                <w:szCs w:val="20"/>
+              </w:rPr>
+              <w:t xml:space="preserve">0,909</w:t>
+            </w:r>
+          </w:p>
+        </w:tc>
+        <w:tc>
+          <w:tcPr>
+            <w:tcW w:type="dxa" w:w="760"/>
+            <w:tcBorders>
+              <w:top w:val="none" w:color="FFFFFF" w:sz="0"/>
+              <w:left w:val="none" w:color="FFFFFF" w:sz="0"/>
+              <w:bottom w:val="single" w:color="000000" w:sz="6"/>
+              <w:right w:val="none" w:color="FFFFFF" w:sz="0"/>
+            </w:tcBorders>
+            <w:shd w:fill="EAF2FB" w:color="auto" w:val="clear"/>
+            <w:tcMar>
+              <w:top w:type="dxa" w:w="40"/>
+              <w:left w:type="dxa" w:w="80"/>
+              <w:bottom w:type="dxa" w:w="40"/>
+              <w:right w:type="dxa" w:w="80"/>
+            </w:tcMar>
+            <w:vAlign w:val="center"/>
+          </w:tcPr>
+          <w:p>
+            <w:pPr>
+              <w:spacing w:line="240"/>
+              <w:jc w:val="center"/>
+            </w:pPr>
+            <w:r>
+              <w:rPr>
+                <w:rFonts w:ascii="Times New Roman" w:cs="Times New Roman" w:eastAsia="Times New Roman" w:hAnsi="Times New Roman"/>
+                <w:b/>
+                <w:bCs/>
+                <w:sz w:val="20"/>
+                <w:szCs w:val="20"/>
+              </w:rPr>
+              <w:t xml:space="preserve">0,991</w:t>
+            </w:r>
+          </w:p>
+        </w:tc>
+        <w:tc>
+          <w:tcPr>
+            <w:tcW w:type="dxa" w:w="1000"/>
+            <w:tcBorders>
+              <w:top w:val="none" w:color="FFFFFF" w:sz="0"/>
+              <w:left w:val="none" w:color="FFFFFF" w:sz="0"/>
+              <w:bottom w:val="single" w:color="000000" w:sz="6"/>
+              <w:right w:val="none" w:color="FFFFFF" w:sz="0"/>
+            </w:tcBorders>
+            <w:shd w:fill="EAF2FB" w:color="auto" w:val="clear"/>
+            <w:tcMar>
+              <w:top w:type="dxa" w:w="40"/>
+              <w:left w:type="dxa" w:w="80"/>
+              <w:bottom w:type="dxa" w:w="40"/>
+              <w:right w:type="dxa" w:w="80"/>
+            </w:tcMar>
+            <w:vAlign w:val="center"/>
+          </w:tcPr>
+          <w:p>
+            <w:pPr>
+              <w:spacing w:line="240"/>
+              <w:jc w:val="center"/>
+            </w:pPr>
+            <w:r>
+              <w:rPr>
+                <w:rFonts w:ascii="Times New Roman" w:cs="Times New Roman" w:eastAsia="Times New Roman" w:hAnsi="Times New Roman"/>
+                <w:b/>
+                <w:bCs/>
+                <w:sz w:val="20"/>
+                <w:szCs w:val="20"/>
+              </w:rPr>
+              <w:t xml:space="preserve">0,974</w:t>
+            </w:r>
+          </w:p>
+        </w:tc>
+        <w:tc>
+          <w:tcPr>
+            <w:tcW w:type="dxa" w:w="900"/>
+            <w:tcBorders>
+              <w:top w:val="none" w:color="FFFFFF" w:sz="0"/>
+              <w:left w:val="none" w:color="FFFFFF" w:sz="0"/>
+              <w:bottom w:val="single" w:color="000000" w:sz="6"/>
+              <w:right w:val="none" w:color="FFFFFF" w:sz="0"/>
+            </w:tcBorders>
+            <w:shd w:fill="EAF2FB" w:color="auto" w:val="clear"/>
+            <w:tcMar>
+              <w:top w:type="dxa" w:w="40"/>
+              <w:left w:type="dxa" w:w="80"/>
+              <w:bottom w:type="dxa" w:w="40"/>
+              <w:right w:type="dxa" w:w="80"/>
+            </w:tcMar>
+            <w:vAlign w:val="center"/>
+          </w:tcPr>
+          <w:p>
+            <w:pPr>
+              <w:spacing w:line="240"/>
+              <w:jc w:val="center"/>
+            </w:pPr>
+            <w:r>
+              <w:rPr>
+                <w:rFonts w:ascii="Times New Roman" w:cs="Times New Roman" w:eastAsia="Times New Roman" w:hAnsi="Times New Roman"/>
+                <w:b w:val="false"/>
+                <w:bCs w:val="false"/>
+                <w:sz w:val="20"/>
+                <w:szCs w:val="20"/>
+              </w:rPr>
+              <w:t xml:space="preserve">322</w:t>
+            </w:r>
+          </w:p>
+        </w:tc>
+        <w:tc>
+          <w:tcPr>
+            <w:tcW w:type="dxa" w:w="1000"/>
+            <w:tcBorders>
+              <w:top w:val="none" w:color="FFFFFF" w:sz="0"/>
+              <w:left w:val="none" w:color="FFFFFF" w:sz="0"/>
+              <w:bottom w:val="single" w:color="000000" w:sz="6"/>
+              <w:right w:val="none" w:color="FFFFFF" w:sz="0"/>
+            </w:tcBorders>
+            <w:shd w:fill="EAF2FB" w:color="auto" w:val="clear"/>
+            <w:tcMar>
+              <w:top w:type="dxa" w:w="40"/>
+              <w:left w:type="dxa" w:w="80"/>
+              <w:bottom w:type="dxa" w:w="40"/>
+              <w:right w:type="dxa" w:w="80"/>
+            </w:tcMar>
+            <w:vAlign w:val="center"/>
+          </w:tcPr>
+          <w:p>
+            <w:pPr>
+              <w:spacing w:line="240"/>
+              <w:jc w:val="center"/>
+            </w:pPr>
+            <w:r>
+              <w:rPr>
+                <w:rFonts w:ascii="Times New Roman" w:cs="Times New Roman" w:eastAsia="Times New Roman" w:hAnsi="Times New Roman"/>
+                <w:b w:val="false"/>
+                <w:bCs w:val="false"/>
+                <w:sz w:val="20"/>
+                <w:szCs w:val="20"/>
+              </w:rPr>
+              <w:t xml:space="preserve">277</w:t>
             </w:r>
           </w:p>
         </w:tc>
@@ -2778,7 +3086,7 @@
           <w:sz w:val="24"/>
           <w:szCs w:val="24"/>
         </w:rPr>
-        <w:t xml:space="preserve"> sobre el conjunto de entrenamiento. Los resultados fueron estables (desviación ≤ 0,008) y el Random Forest volvió a ganar en Recall, F1 y AUC: su F1 fue 0,915 ± 0,003 frente a 0,821 ± 0,004 del SVM y 0,784 ± 0,004 de la Regresión Logística.</w:t>
+        <w:t xml:space="preserve"> sobre el conjunto de entrenamiento. Los resultados fueron estables (desviación ≤ 0,008) y se mantuvo el mismo orden: el SVM gaussiano obtuvo el mejor F1 (0,888 ± 0,003) y AUC (0,989 ± 0,001), seguido del polinómico (F1 0,879), el SVM lineal (0,821) y la Regresión Logística (0,784).</w:t>
       </w:r>
     </w:p>
     <w:p>
@@ -2793,7 +3101,7 @@
           <w:sz w:val="24"/>
           <w:szCs w:val="24"/>
         </w:rPr>
-        <w:t xml:space="preserve">La Figura 3 muestra que las curvas ROC de la Regresión Logística y del SVM son prácticamente idénticas (AUC 0,977 y 0,976): ambos son modelos </w:t>
+        <w:t xml:space="preserve">La Figura 3 muestra dos grupos de curvas ROC. Los modelos </w:t>
       </w:r>
       <w:r>
         <w:rPr>
@@ -2811,7 +3119,7 @@
           <w:sz w:val="24"/>
           <w:szCs w:val="24"/>
         </w:rPr>
-        <w:t xml:space="preserve"> y sus diferencias de Recall y Precision se deben al punto de corte, no a su capacidad de separar las clases. El Random Forest, al ser </w:t>
+        <w:t xml:space="preserve"> (Regresión Logística y SVM lineal) son prácticamente idénticos (AUC 0,977 y 0,976): sus diferencias de Recall y Precision se deben al punto de corte, no a su capacidad de separar las clases. Los SVM con </w:t>
       </w:r>
       <w:r>
         <w:rPr>
@@ -2821,79 +3129,33 @@
           <w:sz w:val="24"/>
           <w:szCs w:val="24"/>
         </w:rPr>
-        <w:t xml:space="preserve">no lineal</w:t>
-      </w:r>
-      <w:r>
-        <w:rPr>
-          <w:rFonts w:ascii="Times New Roman" w:cs="Times New Roman" w:eastAsia="Times New Roman" w:hAnsi="Times New Roman"/>
-          <w:sz w:val="24"/>
-          <w:szCs w:val="24"/>
-        </w:rPr>
-        <w:t xml:space="preserve">, detecta ≈ 95 % del phishing con solo 2,5 % de falsas alarmas. Sus variables más importantes coinciden con el EDA: </w:t>
-      </w:r>
-      <w:r>
-        <w:rPr>
-          <w:rFonts w:ascii="Courier New" w:cs="Courier New" w:eastAsia="Courier New" w:hAnsi="Courier New"/>
-          <w:sz w:val="21"/>
-          <w:szCs w:val="21"/>
-        </w:rPr>
-        <w:t xml:space="preserve">is_https</w:t>
-      </w:r>
-      <w:r>
-        <w:rPr>
-          <w:rFonts w:ascii="Times New Roman" w:cs="Times New Roman" w:eastAsia="Times New Roman" w:hAnsi="Times New Roman"/>
-          <w:sz w:val="24"/>
-          <w:szCs w:val="24"/>
-        </w:rPr>
-        <w:t xml:space="preserve">, </w:t>
-      </w:r>
-      <w:r>
-        <w:rPr>
-          <w:rFonts w:ascii="Courier New" w:cs="Courier New" w:eastAsia="Courier New" w:hAnsi="Courier New"/>
-          <w:sz w:val="21"/>
-          <w:szCs w:val="21"/>
-        </w:rPr>
-        <w:t xml:space="preserve">entropy</w:t>
-      </w:r>
-      <w:r>
-        <w:rPr>
-          <w:rFonts w:ascii="Times New Roman" w:cs="Times New Roman" w:eastAsia="Times New Roman" w:hAnsi="Times New Roman"/>
-          <w:sz w:val="24"/>
-          <w:szCs w:val="24"/>
-        </w:rPr>
-        <w:t xml:space="preserve">, </w:t>
-      </w:r>
-      <w:r>
-        <w:rPr>
-          <w:rFonts w:ascii="Courier New" w:cs="Courier New" w:eastAsia="Courier New" w:hAnsi="Courier New"/>
-          <w:sz w:val="21"/>
-          <w:szCs w:val="21"/>
-        </w:rPr>
-        <w:t xml:space="preserve">digit_ratio</w:t>
-      </w:r>
-      <w:r>
-        <w:rPr>
-          <w:rFonts w:ascii="Times New Roman" w:cs="Times New Roman" w:eastAsia="Times New Roman" w:hAnsi="Times New Roman"/>
-          <w:sz w:val="24"/>
-          <w:szCs w:val="24"/>
-        </w:rPr>
-        <w:t xml:space="preserve"> y </w:t>
-      </w:r>
-      <w:r>
-        <w:rPr>
-          <w:rFonts w:ascii="Courier New" w:cs="Courier New" w:eastAsia="Courier New" w:hAnsi="Courier New"/>
-          <w:sz w:val="21"/>
-          <w:szCs w:val="21"/>
-        </w:rPr>
-        <w:t xml:space="preserve">dom_len</w:t>
-      </w:r>
-      <w:r>
-        <w:rPr>
-          <w:rFonts w:ascii="Times New Roman" w:cs="Times New Roman" w:eastAsia="Times New Roman" w:hAnsi="Times New Roman"/>
-          <w:sz w:val="24"/>
-          <w:szCs w:val="24"/>
-        </w:rPr>
-        <w:t xml:space="preserve">.</w:t>
+        <w:t xml:space="preserve">kernel</w:t>
+      </w:r>
+      <w:r>
+        <w:rPr>
+          <w:rFonts w:ascii="Times New Roman" w:cs="Times New Roman" w:eastAsia="Times New Roman" w:hAnsi="Times New Roman"/>
+          <w:sz w:val="24"/>
+          <w:szCs w:val="24"/>
+        </w:rPr>
+        <w:t xml:space="preserve"> están claramente por encima (AUC 0,990 y 0,991): con solo 2,5 % de falsas alarmas detectan ≈ 93–94 % del phishing, porque el </w:t>
+      </w:r>
+      <w:r>
+        <w:rPr>
+          <w:rFonts w:ascii="Times New Roman" w:cs="Times New Roman" w:eastAsia="Times New Roman" w:hAnsi="Times New Roman"/>
+          <w:i/>
+          <w:iCs/>
+          <w:sz w:val="24"/>
+          <w:szCs w:val="24"/>
+        </w:rPr>
+        <w:t xml:space="preserve">kernel trick</w:t>
+      </w:r>
+      <w:r>
+        <w:rPr>
+          <w:rFonts w:ascii="Times New Roman" w:cs="Times New Roman" w:eastAsia="Times New Roman" w:hAnsi="Times New Roman"/>
+          <w:sz w:val="24"/>
+          <w:szCs w:val="24"/>
+        </w:rPr>
+        <w:t xml:space="preserve"> permite fronteras no lineales que combinan variables (p. ej. HTTPS con alta entropía y muchos dígitos).</w:t>
       </w:r>
     </w:p>
     <w:p>
@@ -2925,7 +3187,7 @@
           <w:sz w:val="22"/>
           <w:szCs w:val="22"/>
         </w:rPr>
-        <w:t xml:space="preserve">Curvas ROC con zoom en FPR ≤ 0,20 (izquierda) e importancia de variables del Random Forest (derecha)</w:t>
+        <w:t xml:space="preserve">Curvas ROC con zoom en FPR ≤ 0,20 (izquierda) y probabilidades del SVM gaussiano por clase real (derecha)</w:t>
       </w:r>
     </w:p>
     <w:p>
@@ -2937,7 +3199,7 @@
       <w:r>
         <w:drawing>
           <wp:inline distT="0" distB="0" distL="0" distR="0">
-            <wp:extent cx="2524125" cy="1724025"/>
+            <wp:extent cx="2266950" cy="1552575"/>
             <wp:effectExtent t="0" r="0" b="0" l="0"/>
             <wp:docPr id="1" name="" descr="" title=""/>
             <wp:cNvGraphicFramePr>
@@ -2962,7 +3224,7 @@
                   <pic:spPr bwMode="auto">
                     <a:xfrm>
                       <a:off x="0" y="0"/>
-                      <a:ext cx="2524125" cy="1724025"/>
+                      <a:ext cx="2266950" cy="1552575"/>
                     </a:xfrm>
                     <a:prstGeom prst="rect">
                       <a:avLst/>
@@ -2985,7 +3247,7 @@
       <w:r>
         <w:drawing>
           <wp:inline distT="0" distB="0" distL="0" distR="0">
-            <wp:extent cx="2305050" cy="1619250"/>
+            <wp:extent cx="2371725" cy="1390650"/>
             <wp:effectExtent t="0" r="0" b="0" l="0"/>
             <wp:docPr id="1" name="" descr="" title=""/>
             <wp:cNvGraphicFramePr>
@@ -3010,7 +3272,7 @@
                   <pic:spPr bwMode="auto">
                     <a:xfrm>
                       <a:off x="0" y="0"/>
-                      <a:ext cx="2305050" cy="1619250"/>
+                      <a:ext cx="2371725" cy="1390650"/>
                     </a:xfrm>
                     <a:prstGeom prst="rect">
                       <a:avLst/>
@@ -3037,15 +3299,33 @@
           <w:sz w:val="24"/>
           <w:szCs w:val="24"/>
         </w:rPr>
-        <w:t xml:space="preserve">Modelo seleccionado: Random Forest.</w:t>
-      </w:r>
-      <w:r>
-        <w:rPr>
-          <w:rFonts w:ascii="Times New Roman" w:cs="Times New Roman" w:eastAsia="Times New Roman" w:hAnsi="Times New Roman"/>
-          <w:sz w:val="24"/>
-          <w:szCs w:val="24"/>
-        </w:rPr>
-        <w:t xml:space="preserve"> En ciberseguridad, un falso negativo es una posible víctima, por lo que el Recall es la métrica prioritaria: el Random Forest deja pasar 176 ataques frente a 264 de la Regresión Logística y 803 del SVM. A la vez mantiene una Precision de 89,4 % (casi 9 de cada 10 alertas son reales), mientras que la Regresión Logística genera casi 4 veces más falsas alarmas. Tiene además el mejor F1 y AUC. Como contrapartida es menos interpretable y más pesado (≈ 9 MB comprimido), costos aceptables frente a su capacidad de detección. Se reentrenó con el 100 % de los datos y se exportó como </w:t>
+        <w:t xml:space="preserve">Modelo seleccionado: SVM gaussiano (RBF).</w:t>
+      </w:r>
+      <w:r>
+        <w:rPr>
+          <w:rFonts w:ascii="Times New Roman" w:cs="Times New Roman" w:eastAsia="Times New Roman" w:hAnsi="Times New Roman"/>
+          <w:sz w:val="24"/>
+          <w:szCs w:val="24"/>
+        </w:rPr>
+        <w:t xml:space="preserve"> Tiene el mejor F1 (0,909) y AUC (0,991), confirmados con validación cruzada. En ciberseguridad un falso negativo es una posible víctima, por lo que el Recall es prioritario: la Regresión Logística detecta algo más (92,0 % frente a 90,3 %), pero genera </w:t>
+      </w:r>
+      <w:r>
+        <w:rPr>
+          <w:rFonts w:ascii="Times New Roman" w:cs="Times New Roman" w:eastAsia="Times New Roman" w:hAnsi="Times New Roman"/>
+          <w:b/>
+          <w:bCs/>
+          <w:sz w:val="24"/>
+          <w:szCs w:val="24"/>
+        </w:rPr>
+        <w:t xml:space="preserve">5 veces más falsas alarmas</w:t>
+      </w:r>
+      <w:r>
+        <w:rPr>
+          <w:rFonts w:ascii="Times New Roman" w:cs="Times New Roman" w:eastAsia="Times New Roman" w:hAnsi="Times New Roman"/>
+          <w:sz w:val="24"/>
+          <w:szCs w:val="24"/>
+        </w:rPr>
+        <w:t xml:space="preserve"> (1.396 frente a 277), y un detector que se equivoca en 1 de cada 3 alertas termina siendo ignorado. Frente al polinómico, el gaussiano detecta 137 ataques más a cambio de solo 95 falsas alarmas adicionales. Su costo es un entrenamiento más lento (≈ 6 min) y menor interpretabilidad. Se reentrenó con el 100 % de los datos (</w:t>
       </w:r>
       <w:r>
         <w:rPr>
@@ -3053,15 +3333,15 @@
           <w:sz w:val="21"/>
           <w:szCs w:val="21"/>
         </w:rPr>
-        <w:t xml:space="preserve">models/modelo_rf.pkl</w:t>
-      </w:r>
-      <w:r>
-        <w:rPr>
-          <w:rFonts w:ascii="Times New Roman" w:cs="Times New Roman" w:eastAsia="Times New Roman" w:hAnsi="Times New Roman"/>
-          <w:sz w:val="24"/>
-          <w:szCs w:val="24"/>
-        </w:rPr>
-        <w:t xml:space="preserve">.</w:t>
+        <w:t xml:space="preserve">models/modelo_svm_rbf.pkl</w:t>
+      </w:r>
+      <w:r>
+        <w:rPr>
+          <w:rFonts w:ascii="Times New Roman" w:cs="Times New Roman" w:eastAsia="Times New Roman" w:hAnsi="Times New Roman"/>
+          <w:sz w:val="24"/>
+          <w:szCs w:val="24"/>
+        </w:rPr>
+        <w:t xml:space="preserve">).</w:t>
       </w:r>
     </w:p>
     <w:p>
@@ -3147,7 +3427,7 @@
           <w:sz w:val="24"/>
           <w:szCs w:val="24"/>
         </w:rPr>
-        <w:t xml:space="preserve">. El usuario pega una URL, el extractor calcula las 22 variables, el Random Forest devuelve la probabilidad y la app muestra una tarjeta roja con el nivel de riesgo o una verde de sitio seguro, junto con el host, el protocolo, el tipo de dirección y las palabras sensibles detectadas. Un selector permite comparar la misma URL con los tres modelos.</w:t>
+        <w:t xml:space="preserve">. El usuario pega una URL, el extractor calcula las 22 variables, el SVM gaussiano devuelve la probabilidad y la app muestra una tarjeta roja con el nivel de riesgo o una verde de sitio seguro, junto con el host, el protocolo, el tipo de dirección y las palabras sensibles detectadas. Un selector permite comparar la misma URL con los cuatro modelos.</w:t>
       </w:r>
     </w:p>
     <w:p>
@@ -3179,7 +3459,7 @@
           <w:sz w:val="22"/>
           <w:szCs w:val="22"/>
         </w:rPr>
-        <w:t xml:space="preserve">Resultados de la aplicación con el Random Forest: URL legítima (izquierda) y URL de phishing (derecha)</w:t>
+        <w:t xml:space="preserve">Resultados de la aplicación con el SVM gaussiano: URL legítima (izquierda) y URL de phishing (derecha)</w:t>
       </w:r>
     </w:p>
     <w:p>
@@ -3191,7 +3471,7 @@
       <w:r>
         <w:drawing>
           <wp:inline distT="0" distB="0" distL="0" distR="0">
-            <wp:extent cx="2228850" cy="1581150"/>
+            <wp:extent cx="1943100" cy="1381125"/>
             <wp:effectExtent t="0" r="0" b="0" l="0"/>
             <wp:docPr id="1" name="" descr="" title=""/>
             <wp:cNvGraphicFramePr>
@@ -3216,7 +3496,7 @@
                   <pic:spPr bwMode="auto">
                     <a:xfrm>
                       <a:off x="0" y="0"/>
-                      <a:ext cx="2228850" cy="1581150"/>
+                      <a:ext cx="1943100" cy="1381125"/>
                     </a:xfrm>
                     <a:prstGeom prst="rect">
                       <a:avLst/>
@@ -3239,7 +3519,7 @@
       <w:r>
         <w:drawing>
           <wp:inline distT="0" distB="0" distL="0" distR="0">
-            <wp:extent cx="2228850" cy="1695450"/>
+            <wp:extent cx="1943100" cy="1476375"/>
             <wp:effectExtent t="0" r="0" b="0" l="0"/>
             <wp:docPr id="1" name="" descr="" title=""/>
             <wp:cNvGraphicFramePr>
@@ -3264,7 +3544,7 @@
                   <pic:spPr bwMode="auto">
                     <a:xfrm>
                       <a:off x="0" y="0"/>
-                      <a:ext cx="2228850" cy="1695450"/>
+                      <a:ext cx="1943100" cy="1476375"/>
                     </a:xfrm>
                     <a:prstGeom prst="rect">
                       <a:avLst/>
@@ -3339,7 +3619,7 @@
     </w:p>
     <w:p>
       <w:pPr>
-        <w:spacing w:after="40" w:before="0" w:line="360"/>
+        <w:spacing w:after="0" w:before="0" w:line="360"/>
         <w:jc w:val="both"/>
       </w:pPr>
       <w:r>
@@ -3593,15 +3873,15 @@
           <w:sz w:val="24"/>
           <w:szCs w:val="24"/>
         </w:rPr>
-        <w:t xml:space="preserve">Random Forest</w:t>
-      </w:r>
-      <w:r>
-        <w:rPr>
-          <w:rFonts w:ascii="Times New Roman" w:cs="Times New Roman" w:eastAsia="Times New Roman" w:hAnsi="Times New Roman"/>
-          <w:sz w:val="24"/>
-          <w:szCs w:val="24"/>
-        </w:rPr>
-        <w:t xml:space="preserve"> fue el mejor modelo (Recall 94,7 %, F1 0,920, AUC 0,993), con ventajas estables en validación cruzada; su naturaleza no lineal capta combinaciones de variables que los modelos lineales no pueden representar.</w:t>
+        <w:t xml:space="preserve">SVM gaussiano</w:t>
+      </w:r>
+      <w:r>
+        <w:rPr>
+          <w:rFonts w:ascii="Times New Roman" w:cs="Times New Roman" w:eastAsia="Times New Roman" w:hAnsi="Times New Roman"/>
+          <w:sz w:val="24"/>
+          <w:szCs w:val="24"/>
+        </w:rPr>
+        <w:t xml:space="preserve"> fue el mejor modelo (F1 0,909, AUC 0,991, Recall 90,3 %, Precision 91,5 %), con ventajas estables en validación cruzada.</w:t>
       </w:r>
     </w:p>
     <w:p>
@@ -3620,25 +3900,41 @@
           <w:sz w:val="24"/>
           <w:szCs w:val="24"/>
         </w:rPr>
-        <w:t xml:space="preserve">En un problema desbalanceado como este, el </w:t>
-      </w:r>
-      <w:r>
-        <w:rPr>
-          <w:rFonts w:ascii="Times New Roman" w:cs="Times New Roman" w:eastAsia="Times New Roman" w:hAnsi="Times New Roman"/>
-          <w:i/>
-          <w:iCs/>
-          <w:sz w:val="24"/>
-          <w:szCs w:val="24"/>
-        </w:rPr>
-        <w:t xml:space="preserve">Accuracy</w:t>
-      </w:r>
-      <w:r>
-        <w:rPr>
-          <w:rFonts w:ascii="Times New Roman" w:cs="Times New Roman" w:eastAsia="Times New Roman" w:hAnsi="Times New Roman"/>
-          <w:sz w:val="24"/>
-          <w:szCs w:val="24"/>
-        </w:rPr>
-        <w:t xml:space="preserve"> engaña: las decisiones deben basarse en Recall, Precision y F1 de la clase minoritaria.</w:t>
+        <w:t xml:space="preserve">Los </w:t>
+      </w:r>
+      <w:r>
+        <w:rPr>
+          <w:rFonts w:ascii="Times New Roman" w:cs="Times New Roman" w:eastAsia="Times New Roman" w:hAnsi="Times New Roman"/>
+          <w:b/>
+          <w:bCs/>
+          <w:sz w:val="24"/>
+          <w:szCs w:val="24"/>
+        </w:rPr>
+        <w:t xml:space="preserve">kernels</w:t>
+      </w:r>
+      <w:r>
+        <w:rPr>
+          <w:rFonts w:ascii="Times New Roman" w:cs="Times New Roman" w:eastAsia="Times New Roman" w:hAnsi="Times New Roman"/>
+          <w:sz w:val="24"/>
+          <w:szCs w:val="24"/>
+        </w:rPr>
+        <w:t xml:space="preserve"> marcan la diferencia: con el mismo </w:t>
+      </w:r>
+      <w:r>
+        <w:rPr>
+          <w:rFonts w:ascii="Courier New" w:cs="Courier New" w:eastAsia="Courier New" w:hAnsi="Courier New"/>
+          <w:sz w:val="21"/>
+          <w:szCs w:val="21"/>
+        </w:rPr>
+        <w:t xml:space="preserve">C = 1</w:t>
+      </w:r>
+      <w:r>
+        <w:rPr>
+          <w:rFonts w:ascii="Times New Roman" w:cs="Times New Roman" w:eastAsia="Times New Roman" w:hAnsi="Times New Roman"/>
+          <w:sz w:val="24"/>
+          <w:szCs w:val="24"/>
+        </w:rPr>
+        <w:t xml:space="preserve">, pasar del SVM lineal al polinómico o al gaussiano sube el AUC de 0,976 a 0,990–0,991, porque las fronteras no lineales captan combinaciones de variables que un hiperplano no puede representar.</w:t>
       </w:r>
     </w:p>
     <w:p>
@@ -3694,7 +3990,39 @@
           <w:sz w:val="24"/>
           <w:szCs w:val="24"/>
         </w:rPr>
-        <w:t xml:space="preserve">Como trabajo futuro se propone ampliar el dataset con enlaces profundos legítimos y URLs con IP, y ajustar el umbral de decisión según el costo de cada tipo de error.</w:t>
+        <w:t xml:space="preserve">Como trabajo futuro se propone ampliar el dataset con enlaces profundos legítimos y URLs con IP, y ajustar </w:t>
+      </w:r>
+      <w:r>
+        <w:rPr>
+          <w:rFonts w:ascii="Courier New" w:cs="Courier New" w:eastAsia="Courier New" w:hAnsi="Courier New"/>
+          <w:sz w:val="21"/>
+          <w:szCs w:val="21"/>
+        </w:rPr>
+        <w:t xml:space="preserve">C</w:t>
+      </w:r>
+      <w:r>
+        <w:rPr>
+          <w:rFonts w:ascii="Times New Roman" w:cs="Times New Roman" w:eastAsia="Times New Roman" w:hAnsi="Times New Roman"/>
+          <w:sz w:val="24"/>
+          <w:szCs w:val="24"/>
+        </w:rPr>
+        <w:t xml:space="preserve">, </w:t>
+      </w:r>
+      <w:r>
+        <w:rPr>
+          <w:rFonts w:ascii="Courier New" w:cs="Courier New" w:eastAsia="Courier New" w:hAnsi="Courier New"/>
+          <w:sz w:val="21"/>
+          <w:szCs w:val="21"/>
+        </w:rPr>
+        <w:t xml:space="preserve">gamma</w:t>
+      </w:r>
+      <w:r>
+        <w:rPr>
+          <w:rFonts w:ascii="Times New Roman" w:cs="Times New Roman" w:eastAsia="Times New Roman" w:hAnsi="Times New Roman"/>
+          <w:sz w:val="24"/>
+          <w:szCs w:val="24"/>
+        </w:rPr>
+        <w:t xml:space="preserve"> y el umbral de decisión con validación cruzada según el costo de cada tipo de error.</w:t>
       </w:r>
     </w:p>
     <w:p>

</xml_diff>